<commit_message>
Cover letter: PDU revision framing
</commit_message>
<xml_diff>
--- a/paper/cover_letter.docx
+++ b/paper/cover_letter.docx
@@ -99,7 +99,7 @@
           <w:sz w:val="22"/>
           <w:szCs w:val="22"/>
         </w:rPr>
-        <w:t xml:space="preserve">Astronomy and Computing</w:t>
+        <w:t xml:space="preserve">Physics of the Dark Universe</w:t>
       </w:r>
     </w:p>
     <w:p>
@@ -123,7 +123,7 @@
           <w:sz w:val="22"/>
           <w:szCs w:val="22"/>
         </w:rPr>
-        <w:t xml:space="preserve">I submit for your consideration the manuscript entitled "Interpretable Machine Learning for Galaxy Morphology: A Calibrated Symbolic Concept Bottleneck, and Why Its Explanations Do Not Transfer Across Surveys" for publication in Astronomy and Computing.</w:t>
+        <w:t xml:space="preserve">Please find enclosed a revised version of manuscript [MANUSCRIPT ID], "Interpretable Machine Learning for Galaxy Morphology: A Calibrated Symbolic Concept Bottleneck, and Why Its Explanations Do Not Transfer Across Surveys," submitted for reconsideration following the reviewer’s report. I thank the reviewer for a careful reading, and I have revised the manuscript to address every point raised. A full point-by-point response accompanies this letter as a separate document; I summarise the substance of the revision below.</w:t>
       </w:r>
     </w:p>
     <w:p>
@@ -135,7 +135,7 @@
           <w:sz w:val="22"/>
           <w:szCs w:val="22"/>
         </w:rPr>
-        <w:t xml:space="preserve">Deep convolutional networks now classify galaxy morphology at survey scale, but they reason in representations with no physical referent, and the post-hoc attribution methods used to explain them describe a surrogate rather than the deployed decision. This manuscript takes the alternative route: it constrains the model to be interpretable by construction. We present the first Concept Bottleneck Model for galaxy morphology, in which a Zoobot ConvNeXt backbone predicts seventeen physically named concepts (ten Galaxy Zoo decision-tree tasks and seven statmorph structural statistics), and we replace the usual dense linear head with a compact analytic rule set discovered by symbolic regression. The deployed classifier is seven equations totalling 153 operator nodes, printed in full in the paper.</w:t>
+        <w:t xml:space="preserve">The central criticism was that a paper whose subject is interpretability must itself be interpretable by its readership, and that this manuscript, in its submitted form, was not: it described the classifier’s equations rather than printing them, introduced its concept vocabulary after using it, and moved through conformal prediction and cross-survey rule stability too quickly for a reader without a machine-learning background. I accept this criticism without reservation. The revision adds a new appendix printing all seven governing equations in full, with a symbol dictionary; states the complete seventeen-concept vocabulary at first use; and rewrites the sections on conformal prediction and survey shift in plain language, defining every term before it is used.</w:t>
       </w:r>
     </w:p>
     <w:p>
@@ -147,7 +147,7 @@
           <w:sz w:val="22"/>
           <w:szCs w:val="22"/>
         </w:rPr>
-        <w:t xml:space="preserve">On 40,498 Galaxy Zoo Evo galaxies we measure what this interpretability costs rather than asserting it is free. An unconstrained ConvNeXt reaches a Cohen kappa of 0.601 against the symbolic head 0.571, so the concept bottleneck gives up 0.030. The symbolic head, a dense linear head and gradient-boosted trees over the same concepts agree to within 0.002, which localises that cost to the bottleneck rather than to the symbolic form of the classifier. A practitioner who accepts the concept layer for auditability can therefore adopt the analytic rule set at no further accuracy penalty, in place of a 15-million-parameter network. On macro-F1, which weights the rare morphologies equally, the ordering reverses and every concept-based model exceeds the network.</w:t>
+        <w:t xml:space="preserve">Two results changed as a direct consequence of taking the review seriously rather than defending the original text. First, the reviewer asked for direct evidence that the discovered rules reproduce the Galaxy Zoo decision-tree structure; testing this mechanically showed the submitted claim was too strong. Six of seven rules factor through the root task rather than all seven, and the manuscript now reports the corrected, narrower finding. Second, the reviewer noted that the rare-class conformal coverage failure was identified but not addressed; I have now implemented class-conditional calibration rather than deferring it, and the result is a genuine trade rather than a clean fix—worst-case coverage rises from 0.083 to 0.885, but mean prediction-set size roughly triples and no test galaxy receives a unique label. Both findings are reported plainly, including where they revise or complicate the paper’s original claims.</w:t>
       </w:r>
     </w:p>
     <w:p>
@@ -159,7 +159,7 @@
           <w:sz w:val="22"/>
           <w:szCs w:val="22"/>
         </w:rPr>
-        <w:t xml:space="preserve">Two further results are, in my view, of wider consequence than the accuracy comparison, and they are the reason I believe this work suits your readership. First, split-conformal calibration is marginally exact (88.9% empirical against a 90% target) while per-class coverage ranges from 0.98 for ellipticals to 0.08 for the rarest spiral class. The guarantee is satisfied almost entirely by over-covering the dominant class, which directly threatens rare-object science; reporting marginal coverage alone is therefore misleading on the imbalanced samples typical of morphology catalogues. Second, applying the frozen pipeline to 161,395 Euclid Q1 galaxies preserves classification accuracy while a symbolic refit on Euclid recovers under half of the reference rules’ concept usage. Accuracy transfer and interpretation transfer are separate properties, and an accuracy-only robustness audit would certify a pipeline whose explanations had silently changed.</w:t>
+        <w:t xml:space="preserve">A third point, on whether the adopted symbolic rules are justified in size or are avoidable complexity, is answered with a new ablation: a rule set one-fifth the size matches the adopted one on held-out accuracy and Cohen’s kappa, and the manuscript now states this directly rather than asserting that the larger expressions are necessary.</w:t>
       </w:r>
     </w:p>
     <w:p>
@@ -171,7 +171,7 @@
           <w:sz w:val="22"/>
           <w:szCs w:val="22"/>
         </w:rPr>
-        <w:t xml:space="preserve">I believe this work fits the scope of Astronomy and Computing directly. Its contribution is methodological rather than a new astrophysical measurement: a released and reproducible classification pipeline, together with two diagnostics that other groups can apply to their own morphology models. The rule-stability index and the per-class conformal coverage audit are both offered as reusable evaluation tools, and I hope they are of use to the community independently of the particular architecture reported here.</w:t>
+        <w:t xml:space="preserve">All revised numbers are traced to a machine-readable results file and checked against a manifest of paper claims at build time, and the two new analyses are released as part of the public code alongside the rest of the pipeline. I believe the manuscript is substantially strengthened by this process and hope it is now suitable for publication in Physics of the Dark Universe.</w:t>
       </w:r>
     </w:p>
     <w:p>
@@ -183,19 +183,7 @@
           <w:sz w:val="22"/>
           <w:szCs w:val="22"/>
         </w:rPr>
-        <w:t xml:space="preserve">All code, configurations, random seeds and derived results are released publicly. Every number quoted in the manuscript is written to a machine-readable results file by the evaluation stage and checked against a manifest of paper claims at build time, so the reported values can be regenerated from a single command. The manuscript also states its limitations plainly, including the severe class imbalance that bounds conclusions about the two rarest morphologies and the uncontrolled nature of the cross-survey comparison.</w:t>
-      </w:r>
-    </w:p>
-    <w:p>
-      <w:pPr>
-        <w:spacing w:after="160" w:line="276"/>
-      </w:pPr>
-      <w:r>
-        <w:rPr>
-          <w:sz w:val="22"/>
-          <w:szCs w:val="22"/>
-        </w:rPr>
-        <w:t xml:space="preserve">This manuscript is original, has not been published previously, and is not under consideration by any other journal. I am the sole author and declare no competing interests. [ADD IF APPLICABLE: suggested reviewers and any opposed reviewers.]</w:t>
+        <w:t xml:space="preserve">This manuscript remains original, has not been published elsewhere, and is not under consideration by any other journal. I am the sole author and declare no competing interests.</w:t>
       </w:r>
     </w:p>
     <w:p>
@@ -207,7 +195,7 @@
           <w:sz w:val="22"/>
           <w:szCs w:val="22"/>
         </w:rPr>
-        <w:t xml:space="preserve">Thank you for considering this work.</w:t>
+        <w:t xml:space="preserve">Thank you for considering this revision.</w:t>
       </w:r>
     </w:p>
     <w:p>

</xml_diff>